<commit_message>
fix(verify-pe): match student wording instead of exact strings; guide CSV rules
</commit_message>
<xml_diff>
--- a/docs/PE-Lab-Completion-Guide.docx
+++ b/docs/PE-Lab-Completion-Guide.docx
@@ -1794,6 +1794,110 @@
       </w:r>
     </w:p>
     <w:p>
+      <w:pPr>
+        <w:pStyle w:val="BodyText"/>
+      </w:pPr>
+      <w:r>
+        <w:t xml:space="preserve">Three rules that keep a CSV readable by the grader:</w:t>
+      </w:r>
+    </w:p>
+    <w:p>
+      <w:pPr>
+        <w:numPr>
+          <w:ilvl w:val="0"/>
+          <w:numId w:val="1011"/>
+        </w:numPr>
+        <w:pStyle w:val="Compact"/>
+      </w:pPr>
+      <w:r>
+        <w:rPr>
+          <w:b/>
+        </w:rPr>
+        <w:t xml:space="preserve">One record per line.</w:t>
+      </w:r>
+      <w:r>
+        <w:t xml:space="preserve"> </w:t>
+      </w:r>
+      <w:r>
+        <w:t xml:space="preserve">Never press Enter inside a cell — the part after the line break</w:t>
+      </w:r>
+      <w:r>
+        <w:t xml:space="preserve"> </w:t>
+      </w:r>
+      <w:r>
+        <w:t xml:space="preserve">becomes a broken row and the rest of your answer is lost. In Notepad, turn on</w:t>
+      </w:r>
+      <w:r>
+        <w:t xml:space="preserve"> </w:t>
+      </w:r>
+      <w:r>
+        <w:rPr>
+          <w:i/>
+        </w:rPr>
+        <w:t xml:space="preserve">Format → Word Wrap</w:t>
+      </w:r>
+      <w:r>
+        <w:t xml:space="preserve"> </w:t>
+      </w:r>
+      <w:r>
+        <w:t xml:space="preserve">so a long sentence wraps on screen without adding a line break.</w:t>
+      </w:r>
+    </w:p>
+    <w:p>
+      <w:pPr>
+        <w:numPr>
+          <w:ilvl w:val="0"/>
+          <w:numId w:val="1011"/>
+        </w:numPr>
+        <w:pStyle w:val="Compact"/>
+      </w:pPr>
+      <w:r>
+        <w:rPr>
+          <w:b/>
+        </w:rPr>
+        <w:t xml:space="preserve">Do not add columns.</w:t>
+      </w:r>
+      <w:r>
+        <w:t xml:space="preserve"> </w:t>
+      </w:r>
+      <w:r>
+        <w:t xml:space="preserve">Put everything in the columns that are already in the header row;</w:t>
+      </w:r>
+      <w:r>
+        <w:t xml:space="preserve"> </w:t>
+      </w:r>
+      <w:r>
+        <w:t xml:space="preserve">an extra value on the end shifts the row and it stops matching.</w:t>
+      </w:r>
+    </w:p>
+    <w:p>
+      <w:pPr>
+        <w:numPr>
+          <w:ilvl w:val="0"/>
+          <w:numId w:val="1011"/>
+        </w:numPr>
+        <w:pStyle w:val="Compact"/>
+      </w:pPr>
+      <w:r>
+        <w:rPr>
+          <w:b/>
+        </w:rPr>
+        <w:t xml:space="preserve">Edit the existing row.</w:t>
+      </w:r>
+      <w:r>
+        <w:t xml:space="preserve"> </w:t>
+      </w:r>
+      <w:r>
+        <w:t xml:space="preserve">Change the seeded row in place rather than appending a second</w:t>
+      </w:r>
+      <w:r>
+        <w:t xml:space="preserve"> </w:t>
+      </w:r>
+      <w:r>
+        <w:t xml:space="preserve">row for the same badge or subject.</w:t>
+      </w:r>
+    </w:p>
+    <w:p>
       <w:r>
         <w:pict>
           <v:rect style="width:0;height:1.5pt" o:hralign="center" o:hrstd="t" o:hr="t"/>
@@ -1846,7 +1950,7 @@
       <w:pPr>
         <w:numPr>
           <w:ilvl w:val="0"/>
-          <w:numId w:val="1011"/>
+          <w:numId w:val="1012"/>
         </w:numPr>
         <w:pStyle w:val="Compact"/>
       </w:pPr>
@@ -1867,7 +1971,7 @@
       <w:pPr>
         <w:numPr>
           <w:ilvl w:val="0"/>
-          <w:numId w:val="1011"/>
+          <w:numId w:val="1012"/>
         </w:numPr>
         <w:pStyle w:val="Compact"/>
       </w:pPr>
@@ -1927,7 +2031,7 @@
       <w:pPr>
         <w:numPr>
           <w:ilvl w:val="0"/>
-          <w:numId w:val="1011"/>
+          <w:numId w:val="1012"/>
         </w:numPr>
         <w:pStyle w:val="Compact"/>
       </w:pPr>
@@ -1963,7 +2067,7 @@
       <w:pPr>
         <w:numPr>
           <w:ilvl w:val="0"/>
-          <w:numId w:val="1011"/>
+          <w:numId w:val="1012"/>
         </w:numPr>
         <w:pStyle w:val="Compact"/>
       </w:pPr>
@@ -2516,7 +2620,7 @@
       <w:pPr>
         <w:numPr>
           <w:ilvl w:val="0"/>
-          <w:numId w:val="1012"/>
+          <w:numId w:val="1013"/>
         </w:numPr>
         <w:pStyle w:val="Compact"/>
       </w:pPr>
@@ -2537,7 +2641,7 @@
       <w:pPr>
         <w:numPr>
           <w:ilvl w:val="0"/>
-          <w:numId w:val="1012"/>
+          <w:numId w:val="1013"/>
         </w:numPr>
         <w:pStyle w:val="Compact"/>
       </w:pPr>
@@ -2558,7 +2662,7 @@
       <w:pPr>
         <w:numPr>
           <w:ilvl w:val="0"/>
-          <w:numId w:val="1012"/>
+          <w:numId w:val="1013"/>
         </w:numPr>
         <w:pStyle w:val="Compact"/>
       </w:pPr>
@@ -2579,7 +2683,7 @@
       <w:pPr>
         <w:numPr>
           <w:ilvl w:val="0"/>
-          <w:numId w:val="1012"/>
+          <w:numId w:val="1013"/>
         </w:numPr>
         <w:pStyle w:val="Compact"/>
       </w:pPr>
@@ -2610,7 +2714,7 @@
       <w:pPr>
         <w:numPr>
           <w:ilvl w:val="0"/>
-          <w:numId w:val="1013"/>
+          <w:numId w:val="1014"/>
         </w:numPr>
       </w:pPr>
       <w:r>
@@ -2630,7 +2734,7 @@
       <w:pPr>
         <w:numPr>
           <w:ilvl w:val="0"/>
-          <w:numId w:val="1013"/>
+          <w:numId w:val="1014"/>
         </w:numPr>
       </w:pPr>
       <w:r>
@@ -2638,107 +2742,6 @@
           <w:b/>
         </w:rPr>
         <w:t xml:space="preserve">Compare the employee roster to the badge roster:</w:t>
-      </w:r>
-    </w:p>
-    <w:p>
-      <w:pPr>
-        <w:numPr>
-          <w:ilvl w:val="1"/>
-          <w:numId w:val="1014"/>
-        </w:numPr>
-        <w:pStyle w:val="Compact"/>
-      </w:pPr>
-      <w:r>
-        <w:t xml:space="preserve">Taylor Reed (</w:t>
-      </w:r>
-      <w:r>
-        <w:rPr>
-          <w:rStyle w:val="VerbatimChar"/>
-        </w:rPr>
-        <w:t xml:space="preserve">EMP-104</w:t>
-      </w:r>
-      <w:r>
-        <w:t xml:space="preserve">) is</w:t>
-      </w:r>
-      <w:r>
-        <w:t xml:space="preserve"> </w:t>
-      </w:r>
-      <w:r>
-        <w:rPr>
-          <w:b/>
-        </w:rPr>
-        <w:t xml:space="preserve">Terminated</w:t>
-      </w:r>
-      <w:r>
-        <w:t xml:space="preserve"> </w:t>
-      </w:r>
-      <w:r>
-        <w:t xml:space="preserve">with a termination date of</w:t>
-      </w:r>
-      <w:r>
-        <w:t xml:space="preserve"> </w:t>
-      </w:r>
-      <w:r>
-        <w:rPr>
-          <w:rStyle w:val="VerbatimChar"/>
-        </w:rPr>
-        <w:t xml:space="preserve">2026-05-28</w:t>
-      </w:r>
-    </w:p>
-    <w:p>
-      <w:pPr>
-        <w:numPr>
-          <w:ilvl w:val="1"/>
-          <w:numId w:val="1014"/>
-        </w:numPr>
-        <w:pStyle w:val="Compact"/>
-      </w:pPr>
-      <w:r>
-        <w:t xml:space="preserve">Yet badge</w:t>
-      </w:r>
-      <w:r>
-        <w:t xml:space="preserve"> </w:t>
-      </w:r>
-      <w:r>
-        <w:rPr>
-          <w:rStyle w:val="VerbatimChar"/>
-        </w:rPr>
-        <w:t xml:space="preserve">B-PXX-104</w:t>
-      </w:r>
-      <w:r>
-        <w:t xml:space="preserve"> </w:t>
-      </w:r>
-      <w:r>
-        <w:t xml:space="preserve">is still</w:t>
-      </w:r>
-      <w:r>
-        <w:t xml:space="preserve"> </w:t>
-      </w:r>
-      <w:r>
-        <w:rPr>
-          <w:b/>
-        </w:rPr>
-        <w:t xml:space="preserve">Active</w:t>
-      </w:r>
-      <w:r>
-        <w:t xml:space="preserve"> </w:t>
-      </w:r>
-      <w:r>
-        <w:t xml:space="preserve">and still on the server-room access list — that access should have been removed at termination</w:t>
-      </w:r>
-    </w:p>
-    <w:p>
-      <w:pPr>
-        <w:numPr>
-          <w:ilvl w:val="0"/>
-          <w:numId w:val="1013"/>
-        </w:numPr>
-      </w:pPr>
-      <w:r>
-        <w:rPr>
-          <w:b/>
-        </w:rPr>
-        <w:t xml:space="preserve">Check the approval column on the server-room access list:</w:t>
       </w:r>
     </w:p>
     <w:p>
@@ -2750,40 +2753,40 @@
         <w:pStyle w:val="Compact"/>
       </w:pPr>
       <w:r>
-        <w:t xml:space="preserve">Morgan Blake (</w:t>
-      </w:r>
-      <w:r>
-        <w:rPr>
-          <w:rStyle w:val="VerbatimChar"/>
-        </w:rPr>
-        <w:t xml:space="preserve">CTR-209</w:t>
-      </w:r>
-      <w:r>
-        <w:t xml:space="preserve">) has</w:t>
-      </w:r>
-      <w:r>
-        <w:t xml:space="preserve"> </w:t>
-      </w:r>
-      <w:r>
-        <w:rPr>
-          <w:b/>
-        </w:rPr>
-        <w:t xml:space="preserve">Unescorted</w:t>
-      </w:r>
-      <w:r>
-        <w:t xml:space="preserve"> </w:t>
-      </w:r>
-      <w:r>
-        <w:t xml:space="preserve">server-room access with</w:t>
-      </w:r>
-      <w:r>
-        <w:t xml:space="preserve"> </w:t>
-      </w:r>
-      <w:r>
-        <w:rPr>
-          <w:b/>
-        </w:rPr>
-        <w:t xml:space="preserve">no approval on file</w:t>
+        <w:t xml:space="preserve">Taylor Reed (</w:t>
+      </w:r>
+      <w:r>
+        <w:rPr>
+          <w:rStyle w:val="VerbatimChar"/>
+        </w:rPr>
+        <w:t xml:space="preserve">EMP-104</w:t>
+      </w:r>
+      <w:r>
+        <w:t xml:space="preserve">) is</w:t>
+      </w:r>
+      <w:r>
+        <w:t xml:space="preserve"> </w:t>
+      </w:r>
+      <w:r>
+        <w:rPr>
+          <w:b/>
+        </w:rPr>
+        <w:t xml:space="preserve">Terminated</w:t>
+      </w:r>
+      <w:r>
+        <w:t xml:space="preserve"> </w:t>
+      </w:r>
+      <w:r>
+        <w:t xml:space="preserve">with a termination date of</w:t>
+      </w:r>
+      <w:r>
+        <w:t xml:space="preserve"> </w:t>
+      </w:r>
+      <w:r>
+        <w:rPr>
+          <w:rStyle w:val="VerbatimChar"/>
+        </w:rPr>
+        <w:t xml:space="preserve">2026-05-28</w:t>
       </w:r>
     </w:p>
     <w:p>
@@ -2795,6 +2798,107 @@
         <w:pStyle w:val="Compact"/>
       </w:pPr>
       <w:r>
+        <w:t xml:space="preserve">Yet badge</w:t>
+      </w:r>
+      <w:r>
+        <w:t xml:space="preserve"> </w:t>
+      </w:r>
+      <w:r>
+        <w:rPr>
+          <w:rStyle w:val="VerbatimChar"/>
+        </w:rPr>
+        <w:t xml:space="preserve">B-PXX-104</w:t>
+      </w:r>
+      <w:r>
+        <w:t xml:space="preserve"> </w:t>
+      </w:r>
+      <w:r>
+        <w:t xml:space="preserve">is still</w:t>
+      </w:r>
+      <w:r>
+        <w:t xml:space="preserve"> </w:t>
+      </w:r>
+      <w:r>
+        <w:rPr>
+          <w:b/>
+        </w:rPr>
+        <w:t xml:space="preserve">Active</w:t>
+      </w:r>
+      <w:r>
+        <w:t xml:space="preserve"> </w:t>
+      </w:r>
+      <w:r>
+        <w:t xml:space="preserve">and still on the server-room access list — that access should have been removed at termination</w:t>
+      </w:r>
+    </w:p>
+    <w:p>
+      <w:pPr>
+        <w:numPr>
+          <w:ilvl w:val="0"/>
+          <w:numId w:val="1014"/>
+        </w:numPr>
+      </w:pPr>
+      <w:r>
+        <w:rPr>
+          <w:b/>
+        </w:rPr>
+        <w:t xml:space="preserve">Check the approval column on the server-room access list:</w:t>
+      </w:r>
+    </w:p>
+    <w:p>
+      <w:pPr>
+        <w:numPr>
+          <w:ilvl w:val="1"/>
+          <w:numId w:val="1016"/>
+        </w:numPr>
+        <w:pStyle w:val="Compact"/>
+      </w:pPr>
+      <w:r>
+        <w:t xml:space="preserve">Morgan Blake (</w:t>
+      </w:r>
+      <w:r>
+        <w:rPr>
+          <w:rStyle w:val="VerbatimChar"/>
+        </w:rPr>
+        <w:t xml:space="preserve">CTR-209</w:t>
+      </w:r>
+      <w:r>
+        <w:t xml:space="preserve">) has</w:t>
+      </w:r>
+      <w:r>
+        <w:t xml:space="preserve"> </w:t>
+      </w:r>
+      <w:r>
+        <w:rPr>
+          <w:b/>
+        </w:rPr>
+        <w:t xml:space="preserve">Unescorted</w:t>
+      </w:r>
+      <w:r>
+        <w:t xml:space="preserve"> </w:t>
+      </w:r>
+      <w:r>
+        <w:t xml:space="preserve">server-room access with</w:t>
+      </w:r>
+      <w:r>
+        <w:t xml:space="preserve"> </w:t>
+      </w:r>
+      <w:r>
+        <w:rPr>
+          <w:b/>
+        </w:rPr>
+        <w:t xml:space="preserve">no approval on file</w:t>
+      </w:r>
+    </w:p>
+    <w:p>
+      <w:pPr>
+        <w:numPr>
+          <w:ilvl w:val="1"/>
+          <w:numId w:val="1016"/>
+        </w:numPr>
+        <w:pStyle w:val="Compact"/>
+      </w:pPr>
+      <w:r>
         <w:t xml:space="preserve">Physical access to a restricted area must be approved by an authorized approver; unapproved access is unauthorized regardless of whether the badge works</w:t>
       </w:r>
     </w:p>
@@ -2802,7 +2906,7 @@
       <w:pPr>
         <w:numPr>
           <w:ilvl w:val="0"/>
-          <w:numId w:val="1013"/>
+          <w:numId w:val="1014"/>
         </w:numPr>
       </w:pPr>
       <w:r>
@@ -3145,10 +3249,25 @@
         <w:t xml:space="preserve"> </w:t>
       </w:r>
       <w:r>
-        <w:t xml:space="preserve">column must be exactly</w:t>
-      </w:r>
-      <w:r>
-        <w:t xml:space="preserve"> </w:t>
+        <w:t xml:space="preserve">column must say the access was</w:t>
+      </w:r>
+      <w:r>
+        <w:t xml:space="preserve"> </w:t>
+      </w:r>
+      <w:r>
+        <w:rPr>
+          <w:b/>
+        </w:rPr>
+        <w:t xml:space="preserve">unauthorized</w:t>
+      </w:r>
+      <w:r>
+        <w:t xml:space="preserve">; wording around it is fine</w:t>
+      </w:r>
+      <w:r>
+        <w:t xml:space="preserve"> </w:t>
+      </w:r>
+      <w:r>
+        <w:t xml:space="preserve">(</w:t>
       </w:r>
       <w:r>
         <w:rPr>
@@ -3157,10 +3276,31 @@
         <w:t xml:space="preserve">Unauthorized</w:t>
       </w:r>
       <w:r>
-        <w:t xml:space="preserve"> </w:t>
-      </w:r>
-      <w:r>
-        <w:t xml:space="preserve">for both rows.</w:t>
+        <w:t xml:space="preserve">,</w:t>
+      </w:r>
+      <w:r>
+        <w:t xml:space="preserve"> </w:t>
+      </w:r>
+      <w:r>
+        <w:rPr>
+          <w:rStyle w:val="VerbatimChar"/>
+        </w:rPr>
+        <w:t xml:space="preserve">Unauthorized access</w:t>
+      </w:r>
+      <w:r>
+        <w:t xml:space="preserve">,</w:t>
+      </w:r>
+      <w:r>
+        <w:t xml:space="preserve"> </w:t>
+      </w:r>
+      <w:r>
+        <w:rPr>
+          <w:rStyle w:val="VerbatimChar"/>
+        </w:rPr>
+        <w:t xml:space="preserve">Unauthorized - terminated</w:t>
+      </w:r>
+      <w:r>
+        <w:t xml:space="preserve">).</w:t>
       </w:r>
     </w:p>
     <w:p>
@@ -3177,7 +3317,7 @@
       <w:pPr>
         <w:numPr>
           <w:ilvl w:val="0"/>
-          <w:numId w:val="1016"/>
+          <w:numId w:val="1017"/>
         </w:numPr>
         <w:pStyle w:val="Compact"/>
       </w:pPr>
@@ -3212,38 +3352,23 @@
         <w:t xml:space="preserve"> </w:t>
       </w:r>
       <w:r>
-        <w:t xml:space="preserve">have</w:t>
-      </w:r>
-      <w:r>
-        <w:t xml:space="preserve"> </w:t>
-      </w:r>
-      <w:r>
-        <w:rPr>
-          <w:rStyle w:val="VerbatimChar"/>
-        </w:rPr>
-        <w:t xml:space="preserve">Finding</w:t>
-      </w:r>
-      <w:r>
-        <w:t xml:space="preserve"> </w:t>
-      </w:r>
-      <w:r>
-        <w:t xml:space="preserve">=</w:t>
-      </w:r>
-      <w:r>
-        <w:t xml:space="preserve"> </w:t>
-      </w:r>
-      <w:r>
-        <w:rPr>
-          <w:rStyle w:val="VerbatimChar"/>
-        </w:rPr>
-        <w:t xml:space="preserve">Unauthorized</w:t>
-      </w:r>
-    </w:p>
-    <w:p>
-      <w:pPr>
-        <w:numPr>
-          <w:ilvl w:val="0"/>
-          <w:numId w:val="1016"/>
+        <w:t xml:space="preserve">are found</w:t>
+      </w:r>
+      <w:r>
+        <w:t xml:space="preserve"> </w:t>
+      </w:r>
+      <w:r>
+        <w:rPr>
+          <w:b/>
+        </w:rPr>
+        <w:t xml:space="preserve">unauthorized</w:t>
+      </w:r>
+    </w:p>
+    <w:p>
+      <w:pPr>
+        <w:numPr>
+          <w:ilvl w:val="0"/>
+          <w:numId w:val="1017"/>
         </w:numPr>
         <w:pStyle w:val="Compact"/>
       </w:pPr>
@@ -3267,7 +3392,7 @@
       <w:pPr>
         <w:numPr>
           <w:ilvl w:val="0"/>
-          <w:numId w:val="1016"/>
+          <w:numId w:val="1017"/>
         </w:numPr>
         <w:pStyle w:val="Compact"/>
       </w:pPr>
@@ -3291,7 +3416,7 @@
       <w:pPr>
         <w:numPr>
           <w:ilvl w:val="0"/>
-          <w:numId w:val="1016"/>
+          <w:numId w:val="1017"/>
         </w:numPr>
         <w:pStyle w:val="Compact"/>
       </w:pPr>
@@ -3428,7 +3553,7 @@
       <w:pPr>
         <w:numPr>
           <w:ilvl w:val="0"/>
-          <w:numId w:val="1017"/>
+          <w:numId w:val="1018"/>
         </w:numPr>
         <w:pStyle w:val="Compact"/>
       </w:pPr>
@@ -3473,7 +3598,7 @@
       <w:pPr>
         <w:numPr>
           <w:ilvl w:val="0"/>
-          <w:numId w:val="1017"/>
+          <w:numId w:val="1018"/>
         </w:numPr>
         <w:pStyle w:val="Compact"/>
       </w:pPr>
@@ -3494,7 +3619,7 @@
       <w:pPr>
         <w:numPr>
           <w:ilvl w:val="0"/>
-          <w:numId w:val="1017"/>
+          <w:numId w:val="1018"/>
         </w:numPr>
         <w:pStyle w:val="Compact"/>
       </w:pPr>
@@ -3524,7 +3649,7 @@
       <w:pPr>
         <w:numPr>
           <w:ilvl w:val="0"/>
-          <w:numId w:val="1017"/>
+          <w:numId w:val="1018"/>
         </w:numPr>
         <w:pStyle w:val="Compact"/>
       </w:pPr>
@@ -3555,7 +3680,7 @@
       <w:pPr>
         <w:numPr>
           <w:ilvl w:val="0"/>
-          <w:numId w:val="1018"/>
+          <w:numId w:val="1019"/>
         </w:numPr>
       </w:pPr>
       <w:r>
@@ -3575,43 +3700,43 @@
       <w:pPr>
         <w:numPr>
           <w:ilvl w:val="1"/>
+          <w:numId w:val="1020"/>
+        </w:numPr>
+        <w:pStyle w:val="Compact"/>
+      </w:pPr>
+      <w:r>
+        <w:t xml:space="preserve">Was the person employed and active on that date?</w:t>
+      </w:r>
+    </w:p>
+    <w:p>
+      <w:pPr>
+        <w:numPr>
+          <w:ilvl w:val="1"/>
+          <w:numId w:val="1020"/>
+        </w:numPr>
+        <w:pStyle w:val="Compact"/>
+      </w:pPr>
+      <w:r>
+        <w:t xml:space="preserve">Are they on the server-room access list with approval?</w:t>
+      </w:r>
+    </w:p>
+    <w:p>
+      <w:pPr>
+        <w:numPr>
+          <w:ilvl w:val="1"/>
+          <w:numId w:val="1020"/>
+        </w:numPr>
+        <w:pStyle w:val="Compact"/>
+      </w:pPr>
+      <w:r>
+        <w:t xml:space="preserve">Was an escort required, and was one present?</w:t>
+      </w:r>
+    </w:p>
+    <w:p>
+      <w:pPr>
+        <w:numPr>
+          <w:ilvl w:val="0"/>
           <w:numId w:val="1019"/>
-        </w:numPr>
-        <w:pStyle w:val="Compact"/>
-      </w:pPr>
-      <w:r>
-        <w:t xml:space="preserve">Was the person employed and active on that date?</w:t>
-      </w:r>
-    </w:p>
-    <w:p>
-      <w:pPr>
-        <w:numPr>
-          <w:ilvl w:val="1"/>
-          <w:numId w:val="1019"/>
-        </w:numPr>
-        <w:pStyle w:val="Compact"/>
-      </w:pPr>
-      <w:r>
-        <w:t xml:space="preserve">Are they on the server-room access list with approval?</w:t>
-      </w:r>
-    </w:p>
-    <w:p>
-      <w:pPr>
-        <w:numPr>
-          <w:ilvl w:val="1"/>
-          <w:numId w:val="1019"/>
-        </w:numPr>
-        <w:pStyle w:val="Compact"/>
-      </w:pPr>
-      <w:r>
-        <w:t xml:space="preserve">Was an escort required, and was one present?</w:t>
-      </w:r>
-    </w:p>
-    <w:p>
-      <w:pPr>
-        <w:numPr>
-          <w:ilvl w:val="0"/>
-          <w:numId w:val="1018"/>
         </w:numPr>
       </w:pPr>
       <w:r>
@@ -3995,7 +4120,7 @@
       <w:pPr>
         <w:numPr>
           <w:ilvl w:val="0"/>
-          <w:numId w:val="1018"/>
+          <w:numId w:val="1019"/>
         </w:numPr>
       </w:pPr>
       <w:r>
@@ -4313,7 +4438,7 @@
       <w:pPr>
         <w:numPr>
           <w:ilvl w:val="0"/>
-          <w:numId w:val="1020"/>
+          <w:numId w:val="1021"/>
         </w:numPr>
         <w:pStyle w:val="Compact"/>
       </w:pPr>
@@ -4364,7 +4489,7 @@
       <w:pPr>
         <w:numPr>
           <w:ilvl w:val="0"/>
-          <w:numId w:val="1020"/>
+          <w:numId w:val="1021"/>
         </w:numPr>
         <w:pStyle w:val="Compact"/>
       </w:pPr>
@@ -4415,7 +4540,7 @@
       <w:pPr>
         <w:numPr>
           <w:ilvl w:val="0"/>
-          <w:numId w:val="1020"/>
+          <w:numId w:val="1021"/>
         </w:numPr>
         <w:pStyle w:val="Compact"/>
       </w:pPr>
@@ -4436,7 +4561,7 @@
       <w:pPr>
         <w:numPr>
           <w:ilvl w:val="0"/>
-          <w:numId w:val="1020"/>
+          <w:numId w:val="1021"/>
         </w:numPr>
         <w:pStyle w:val="Compact"/>
       </w:pPr>
@@ -4568,7 +4693,7 @@
       <w:pPr>
         <w:numPr>
           <w:ilvl w:val="0"/>
-          <w:numId w:val="1021"/>
+          <w:numId w:val="1022"/>
         </w:numPr>
         <w:pStyle w:val="Compact"/>
       </w:pPr>
@@ -4619,7 +4744,7 @@
       <w:pPr>
         <w:numPr>
           <w:ilvl w:val="0"/>
-          <w:numId w:val="1021"/>
+          <w:numId w:val="1022"/>
         </w:numPr>
         <w:pStyle w:val="Compact"/>
       </w:pPr>
@@ -4640,7 +4765,7 @@
       <w:pPr>
         <w:numPr>
           <w:ilvl w:val="0"/>
-          <w:numId w:val="1021"/>
+          <w:numId w:val="1022"/>
         </w:numPr>
         <w:pStyle w:val="Compact"/>
       </w:pPr>
@@ -4661,7 +4786,7 @@
       <w:pPr>
         <w:numPr>
           <w:ilvl w:val="0"/>
-          <w:numId w:val="1021"/>
+          <w:numId w:val="1022"/>
         </w:numPr>
         <w:pStyle w:val="Compact"/>
       </w:pPr>
@@ -4682,7 +4807,7 @@
       <w:pPr>
         <w:numPr>
           <w:ilvl w:val="0"/>
-          <w:numId w:val="1021"/>
+          <w:numId w:val="1022"/>
         </w:numPr>
         <w:pStyle w:val="Compact"/>
       </w:pPr>
@@ -4713,7 +4838,7 @@
       <w:pPr>
         <w:numPr>
           <w:ilvl w:val="0"/>
-          <w:numId w:val="1022"/>
+          <w:numId w:val="1023"/>
         </w:numPr>
       </w:pPr>
       <w:r>
@@ -4748,7 +4873,7 @@
       <w:pPr>
         <w:numPr>
           <w:ilvl w:val="0"/>
-          <w:numId w:val="1022"/>
+          <w:numId w:val="1023"/>
         </w:numPr>
       </w:pPr>
       <w:r>
@@ -4807,7 +4932,7 @@
       <w:pPr>
         <w:numPr>
           <w:ilvl w:val="0"/>
-          <w:numId w:val="1022"/>
+          <w:numId w:val="1023"/>
         </w:numPr>
       </w:pPr>
       <w:r>
@@ -4821,183 +4946,183 @@
       <w:pPr>
         <w:numPr>
           <w:ilvl w:val="1"/>
+          <w:numId w:val="1024"/>
+        </w:numPr>
+        <w:pStyle w:val="Compact"/>
+      </w:pPr>
+      <w:r>
+        <w:rPr>
+          <w:rStyle w:val="VerbatimChar"/>
+        </w:rPr>
+        <w:t xml:space="preserve">V-3001</w:t>
+      </w:r>
+      <w:r>
+        <w:t xml:space="preserve"> </w:t>
+      </w:r>
+      <w:r>
+        <w:t xml:space="preserve">Sam Ortega — escort</w:t>
+      </w:r>
+      <w:r>
+        <w:t xml:space="preserve"> </w:t>
+      </w:r>
+      <w:r>
+        <w:rPr>
+          <w:rStyle w:val="VerbatimChar"/>
+        </w:rPr>
+        <w:t xml:space="preserve">EMP-101</w:t>
+      </w:r>
+      <w:r>
+        <w:t xml:space="preserve"> </w:t>
+      </w:r>
+      <w:r>
+        <w:t xml:space="preserve">recorded</w:t>
+      </w:r>
+    </w:p>
+    <w:p>
+      <w:pPr>
+        <w:numPr>
+          <w:ilvl w:val="1"/>
+          <w:numId w:val="1024"/>
+        </w:numPr>
+        <w:pStyle w:val="Compact"/>
+      </w:pPr>
+      <w:r>
+        <w:rPr>
+          <w:rStyle w:val="VerbatimChar"/>
+        </w:rPr>
+        <w:t xml:space="preserve">V-3002</w:t>
+      </w:r>
+      <w:r>
+        <w:t xml:space="preserve"> </w:t>
+      </w:r>
+      <w:r>
+        <w:t xml:space="preserve">Kevin Ross —</w:t>
+      </w:r>
+      <w:r>
+        <w:t xml:space="preserve"> </w:t>
+      </w:r>
+      <w:r>
+        <w:rPr>
+          <w:b/>
+        </w:rPr>
+        <w:t xml:space="preserve">EscortId is blank</w:t>
+      </w:r>
+      <w:r>
+        <w:t xml:space="preserve">, badge</w:t>
+      </w:r>
+      <w:r>
+        <w:t xml:space="preserve"> </w:t>
+      </w:r>
+      <w:r>
+        <w:rPr>
+          <w:rStyle w:val="VerbatimChar"/>
+        </w:rPr>
+        <w:t xml:space="preserve">TEMP-PXX-012</w:t>
+      </w:r>
+      <w:r>
+        <w:t xml:space="preserve">, in 11:05, out 12:20</w:t>
+      </w:r>
+    </w:p>
+    <w:p>
+      <w:pPr>
+        <w:numPr>
+          <w:ilvl w:val="1"/>
+          <w:numId w:val="1024"/>
+        </w:numPr>
+        <w:pStyle w:val="Compact"/>
+      </w:pPr>
+      <w:r>
+        <w:rPr>
+          <w:rStyle w:val="VerbatimChar"/>
+        </w:rPr>
+        <w:t xml:space="preserve">V-3003</w:t>
+      </w:r>
+      <w:r>
+        <w:t xml:space="preserve"> </w:t>
+      </w:r>
+      <w:r>
+        <w:t xml:space="preserve">Renee Park — escort</w:t>
+      </w:r>
+      <w:r>
+        <w:t xml:space="preserve"> </w:t>
+      </w:r>
+      <w:r>
+        <w:rPr>
+          <w:rStyle w:val="VerbatimChar"/>
+        </w:rPr>
+        <w:t xml:space="preserve">EMP-102</w:t>
+      </w:r>
+      <w:r>
+        <w:t xml:space="preserve"> </w:t>
+      </w:r>
+      <w:r>
+        <w:t xml:space="preserve">recorded</w:t>
+      </w:r>
+    </w:p>
+    <w:p>
+      <w:pPr>
+        <w:numPr>
+          <w:ilvl w:val="0"/>
           <w:numId w:val="1023"/>
         </w:numPr>
-        <w:pStyle w:val="Compact"/>
-      </w:pPr>
-      <w:r>
-        <w:rPr>
-          <w:rStyle w:val="VerbatimChar"/>
-        </w:rPr>
-        <w:t xml:space="preserve">V-3001</w:t>
-      </w:r>
-      <w:r>
-        <w:t xml:space="preserve"> </w:t>
-      </w:r>
-      <w:r>
-        <w:t xml:space="preserve">Sam Ortega — escort</w:t>
-      </w:r>
-      <w:r>
-        <w:t xml:space="preserve"> </w:t>
-      </w:r>
-      <w:r>
-        <w:rPr>
-          <w:rStyle w:val="VerbatimChar"/>
-        </w:rPr>
-        <w:t xml:space="preserve">EMP-101</w:t>
-      </w:r>
-      <w:r>
-        <w:t xml:space="preserve"> </w:t>
-      </w:r>
-      <w:r>
-        <w:t xml:space="preserve">recorded</w:t>
-      </w:r>
-    </w:p>
-    <w:p>
-      <w:pPr>
-        <w:numPr>
-          <w:ilvl w:val="1"/>
+      </w:pPr>
+      <w:r>
+        <w:rPr>
+          <w:b/>
+        </w:rPr>
+        <w:t xml:space="preserve">Corroborate with the camera observation:</w:t>
+      </w:r>
+      <w:r>
+        <w:t xml:space="preserve"> </w:t>
+      </w:r>
+      <w:r>
+        <w:t xml:space="preserve">at 11:18 and 11:44 the visitor wearing</w:t>
+      </w:r>
+      <w:r>
+        <w:t xml:space="preserve"> </w:t>
+      </w:r>
+      <w:r>
+        <w:rPr>
+          <w:rStyle w:val="VerbatimChar"/>
+        </w:rPr>
+        <w:t xml:space="preserve">TEMP-PXX-012</w:t>
+      </w:r>
+      <w:r>
+        <w:t xml:space="preserve"> </w:t>
+      </w:r>
+      <w:r>
+        <w:t xml:space="preserve">is in the server-room corridor</w:t>
+      </w:r>
+      <w:r>
+        <w:t xml:space="preserve"> </w:t>
+      </w:r>
+      <w:r>
+        <w:rPr>
+          <w:b/>
+        </w:rPr>
+        <w:t xml:space="preserve">alone</w:t>
+      </w:r>
+      <w:r>
+        <w:t xml:space="preserve">, with no escort visible. That badge belongs to</w:t>
+      </w:r>
+      <w:r>
+        <w:t xml:space="preserve"> </w:t>
+      </w:r>
+      <w:r>
+        <w:rPr>
+          <w:rStyle w:val="VerbatimChar"/>
+        </w:rPr>
+        <w:t xml:space="preserve">V-3002</w:t>
+      </w:r>
+      <w:r>
+        <w:t xml:space="preserve">.</w:t>
+      </w:r>
+    </w:p>
+    <w:p>
+      <w:pPr>
+        <w:numPr>
+          <w:ilvl w:val="0"/>
           <w:numId w:val="1023"/>
-        </w:numPr>
-        <w:pStyle w:val="Compact"/>
-      </w:pPr>
-      <w:r>
-        <w:rPr>
-          <w:rStyle w:val="VerbatimChar"/>
-        </w:rPr>
-        <w:t xml:space="preserve">V-3002</w:t>
-      </w:r>
-      <w:r>
-        <w:t xml:space="preserve"> </w:t>
-      </w:r>
-      <w:r>
-        <w:t xml:space="preserve">Kevin Ross —</w:t>
-      </w:r>
-      <w:r>
-        <w:t xml:space="preserve"> </w:t>
-      </w:r>
-      <w:r>
-        <w:rPr>
-          <w:b/>
-        </w:rPr>
-        <w:t xml:space="preserve">EscortId is blank</w:t>
-      </w:r>
-      <w:r>
-        <w:t xml:space="preserve">, badge</w:t>
-      </w:r>
-      <w:r>
-        <w:t xml:space="preserve"> </w:t>
-      </w:r>
-      <w:r>
-        <w:rPr>
-          <w:rStyle w:val="VerbatimChar"/>
-        </w:rPr>
-        <w:t xml:space="preserve">TEMP-PXX-012</w:t>
-      </w:r>
-      <w:r>
-        <w:t xml:space="preserve">, in 11:05, out 12:20</w:t>
-      </w:r>
-    </w:p>
-    <w:p>
-      <w:pPr>
-        <w:numPr>
-          <w:ilvl w:val="1"/>
-          <w:numId w:val="1023"/>
-        </w:numPr>
-        <w:pStyle w:val="Compact"/>
-      </w:pPr>
-      <w:r>
-        <w:rPr>
-          <w:rStyle w:val="VerbatimChar"/>
-        </w:rPr>
-        <w:t xml:space="preserve">V-3003</w:t>
-      </w:r>
-      <w:r>
-        <w:t xml:space="preserve"> </w:t>
-      </w:r>
-      <w:r>
-        <w:t xml:space="preserve">Renee Park — escort</w:t>
-      </w:r>
-      <w:r>
-        <w:t xml:space="preserve"> </w:t>
-      </w:r>
-      <w:r>
-        <w:rPr>
-          <w:rStyle w:val="VerbatimChar"/>
-        </w:rPr>
-        <w:t xml:space="preserve">EMP-102</w:t>
-      </w:r>
-      <w:r>
-        <w:t xml:space="preserve"> </w:t>
-      </w:r>
-      <w:r>
-        <w:t xml:space="preserve">recorded</w:t>
-      </w:r>
-    </w:p>
-    <w:p>
-      <w:pPr>
-        <w:numPr>
-          <w:ilvl w:val="0"/>
-          <w:numId w:val="1022"/>
-        </w:numPr>
-      </w:pPr>
-      <w:r>
-        <w:rPr>
-          <w:b/>
-        </w:rPr>
-        <w:t xml:space="preserve">Corroborate with the camera observation:</w:t>
-      </w:r>
-      <w:r>
-        <w:t xml:space="preserve"> </w:t>
-      </w:r>
-      <w:r>
-        <w:t xml:space="preserve">at 11:18 and 11:44 the visitor wearing</w:t>
-      </w:r>
-      <w:r>
-        <w:t xml:space="preserve"> </w:t>
-      </w:r>
-      <w:r>
-        <w:rPr>
-          <w:rStyle w:val="VerbatimChar"/>
-        </w:rPr>
-        <w:t xml:space="preserve">TEMP-PXX-012</w:t>
-      </w:r>
-      <w:r>
-        <w:t xml:space="preserve"> </w:t>
-      </w:r>
-      <w:r>
-        <w:t xml:space="preserve">is in the server-room corridor</w:t>
-      </w:r>
-      <w:r>
-        <w:t xml:space="preserve"> </w:t>
-      </w:r>
-      <w:r>
-        <w:rPr>
-          <w:b/>
-        </w:rPr>
-        <w:t xml:space="preserve">alone</w:t>
-      </w:r>
-      <w:r>
-        <w:t xml:space="preserve">, with no escort visible. That badge belongs to</w:t>
-      </w:r>
-      <w:r>
-        <w:t xml:space="preserve"> </w:t>
-      </w:r>
-      <w:r>
-        <w:rPr>
-          <w:rStyle w:val="VerbatimChar"/>
-        </w:rPr>
-        <w:t xml:space="preserve">V-3002</w:t>
-      </w:r>
-      <w:r>
-        <w:t xml:space="preserve">.</w:t>
-      </w:r>
-    </w:p>
-    <w:p>
-      <w:pPr>
-        <w:numPr>
-          <w:ilvl w:val="0"/>
-          <w:numId w:val="1022"/>
         </w:numPr>
       </w:pPr>
       <w:r>
@@ -5327,7 +5452,7 @@
       <w:pPr>
         <w:numPr>
           <w:ilvl w:val="0"/>
-          <w:numId w:val="1024"/>
+          <w:numId w:val="1025"/>
         </w:numPr>
         <w:pStyle w:val="Compact"/>
       </w:pPr>
@@ -5354,7 +5479,7 @@
       <w:pPr>
         <w:numPr>
           <w:ilvl w:val="0"/>
-          <w:numId w:val="1024"/>
+          <w:numId w:val="1025"/>
         </w:numPr>
         <w:pStyle w:val="Compact"/>
       </w:pPr>
@@ -5366,7 +5491,7 @@
       <w:pPr>
         <w:numPr>
           <w:ilvl w:val="0"/>
-          <w:numId w:val="1024"/>
+          <w:numId w:val="1025"/>
         </w:numPr>
         <w:pStyle w:val="Compact"/>
       </w:pPr>
@@ -5393,7 +5518,7 @@
       <w:pPr>
         <w:numPr>
           <w:ilvl w:val="0"/>
-          <w:numId w:val="1024"/>
+          <w:numId w:val="1025"/>
         </w:numPr>
         <w:pStyle w:val="Compact"/>
       </w:pPr>
@@ -5530,7 +5655,7 @@
       <w:pPr>
         <w:numPr>
           <w:ilvl w:val="0"/>
-          <w:numId w:val="1025"/>
+          <w:numId w:val="1026"/>
         </w:numPr>
         <w:pStyle w:val="Compact"/>
       </w:pPr>
@@ -5575,7 +5700,7 @@
       <w:pPr>
         <w:numPr>
           <w:ilvl w:val="0"/>
-          <w:numId w:val="1025"/>
+          <w:numId w:val="1026"/>
         </w:numPr>
         <w:pStyle w:val="Compact"/>
       </w:pPr>
@@ -5606,7 +5731,7 @@
       <w:pPr>
         <w:numPr>
           <w:ilvl w:val="0"/>
-          <w:numId w:val="1026"/>
+          <w:numId w:val="1027"/>
         </w:numPr>
       </w:pPr>
       <w:r>
@@ -5654,7 +5779,7 @@
       <w:pPr>
         <w:numPr>
           <w:ilvl w:val="0"/>
-          <w:numId w:val="1026"/>
+          <w:numId w:val="1027"/>
         </w:numPr>
       </w:pPr>
       <w:r>
@@ -5972,7 +6097,7 @@
       <w:pPr>
         <w:numPr>
           <w:ilvl w:val="0"/>
-          <w:numId w:val="1026"/>
+          <w:numId w:val="1027"/>
         </w:numPr>
       </w:pPr>
       <w:r>
@@ -6007,7 +6132,7 @@
       <w:pPr>
         <w:numPr>
           <w:ilvl w:val="0"/>
-          <w:numId w:val="1026"/>
+          <w:numId w:val="1027"/>
         </w:numPr>
       </w:pPr>
       <w:r>
@@ -6049,7 +6174,7 @@
       <w:pPr>
         <w:numPr>
           <w:ilvl w:val="0"/>
-          <w:numId w:val="1027"/>
+          <w:numId w:val="1028"/>
         </w:numPr>
         <w:pStyle w:val="Compact"/>
       </w:pPr>
@@ -6085,7 +6210,7 @@
       <w:pPr>
         <w:numPr>
           <w:ilvl w:val="0"/>
-          <w:numId w:val="1027"/>
+          <w:numId w:val="1028"/>
         </w:numPr>
         <w:pStyle w:val="Compact"/>
       </w:pPr>
@@ -6121,7 +6246,7 @@
       <w:pPr>
         <w:numPr>
           <w:ilvl w:val="0"/>
-          <w:numId w:val="1027"/>
+          <w:numId w:val="1028"/>
         </w:numPr>
         <w:pStyle w:val="Compact"/>
       </w:pPr>
@@ -6163,7 +6288,7 @@
       <w:pPr>
         <w:numPr>
           <w:ilvl w:val="0"/>
-          <w:numId w:val="1027"/>
+          <w:numId w:val="1028"/>
         </w:numPr>
         <w:pStyle w:val="Compact"/>
       </w:pPr>
@@ -6199,7 +6324,7 @@
       <w:pPr>
         <w:numPr>
           <w:ilvl w:val="0"/>
-          <w:numId w:val="1027"/>
+          <w:numId w:val="1028"/>
         </w:numPr>
         <w:pStyle w:val="Compact"/>
       </w:pPr>
@@ -6346,7 +6471,7 @@
       <w:pPr>
         <w:numPr>
           <w:ilvl w:val="0"/>
-          <w:numId w:val="1028"/>
+          <w:numId w:val="1029"/>
         </w:numPr>
         <w:pStyle w:val="Compact"/>
       </w:pPr>
@@ -6391,7 +6516,7 @@
       <w:pPr>
         <w:numPr>
           <w:ilvl w:val="0"/>
-          <w:numId w:val="1028"/>
+          <w:numId w:val="1029"/>
         </w:numPr>
         <w:pStyle w:val="Compact"/>
       </w:pPr>
@@ -6412,7 +6537,7 @@
       <w:pPr>
         <w:numPr>
           <w:ilvl w:val="0"/>
-          <w:numId w:val="1028"/>
+          <w:numId w:val="1029"/>
         </w:numPr>
         <w:pStyle w:val="Compact"/>
       </w:pPr>
@@ -6454,7 +6579,7 @@
       <w:pPr>
         <w:numPr>
           <w:ilvl w:val="0"/>
-          <w:numId w:val="1028"/>
+          <w:numId w:val="1029"/>
         </w:numPr>
         <w:pStyle w:val="Compact"/>
       </w:pPr>
@@ -6485,7 +6610,7 @@
       <w:pPr>
         <w:numPr>
           <w:ilvl w:val="0"/>
-          <w:numId w:val="1029"/>
+          <w:numId w:val="1030"/>
         </w:numPr>
       </w:pPr>
       <w:r>
@@ -6499,228 +6624,6 @@
       </w:r>
       <w:r>
         <w:t xml:space="preserve">from the badge export and the sign-in sheet:</w:t>
-      </w:r>
-    </w:p>
-    <w:p>
-      <w:pPr>
-        <w:numPr>
-          <w:ilvl w:val="1"/>
-          <w:numId w:val="1030"/>
-        </w:numPr>
-        <w:pStyle w:val="Compact"/>
-      </w:pPr>
-      <w:r>
-        <w:t xml:space="preserve">Visitor sign-in sheet: Casey Morgan in</w:t>
-      </w:r>
-      <w:r>
-        <w:t xml:space="preserve"> </w:t>
-      </w:r>
-      <w:r>
-        <w:rPr>
-          <w:b/>
-        </w:rPr>
-        <w:t xml:space="preserve">15:50</w:t>
-      </w:r>
-      <w:r>
-        <w:t xml:space="preserve">, out</w:t>
-      </w:r>
-      <w:r>
-        <w:t xml:space="preserve"> </w:t>
-      </w:r>
-      <w:r>
-        <w:rPr>
-          <w:b/>
-        </w:rPr>
-        <w:t xml:space="preserve">16:10</w:t>
-      </w:r>
-      <w:r>
-        <w:t xml:space="preserve">, badge</w:t>
-      </w:r>
-      <w:r>
-        <w:t xml:space="preserve"> </w:t>
-      </w:r>
-      <w:r>
-        <w:rPr>
-          <w:rStyle w:val="VerbatimChar"/>
-        </w:rPr>
-        <w:t xml:space="preserve">TEMP-PXX-014</w:t>
-      </w:r>
-      <w:r>
-        <w:t xml:space="preserve"> </w:t>
-      </w:r>
-      <w:r>
-        <w:rPr>
-          <w:b/>
-        </w:rPr>
-        <w:t xml:space="preserve">returned = Yes</w:t>
-      </w:r>
-    </w:p>
-    <w:p>
-      <w:pPr>
-        <w:numPr>
-          <w:ilvl w:val="1"/>
-          <w:numId w:val="1030"/>
-        </w:numPr>
-        <w:pStyle w:val="Compact"/>
-      </w:pPr>
-      <w:r>
-        <w:rPr>
-          <w:rStyle w:val="VerbatimChar"/>
-        </w:rPr>
-        <w:t xml:space="preserve">BC-5001</w:t>
-      </w:r>
-      <w:r>
-        <w:t xml:space="preserve"> </w:t>
-      </w:r>
-      <w:r>
-        <w:t xml:space="preserve">15:55 Main Lobby — consistent with the visit</w:t>
-      </w:r>
-    </w:p>
-    <w:p>
-      <w:pPr>
-        <w:numPr>
-          <w:ilvl w:val="1"/>
-          <w:numId w:val="1030"/>
-        </w:numPr>
-        <w:pStyle w:val="Compact"/>
-      </w:pPr>
-      <w:r>
-        <w:rPr>
-          <w:rStyle w:val="VerbatimChar"/>
-        </w:rPr>
-        <w:t xml:space="preserve">BC-5002</w:t>
-      </w:r>
-      <w:r>
-        <w:t xml:space="preserve"> </w:t>
-      </w:r>
-      <w:r>
-        <w:t xml:space="preserve">16:18 Server Room — already after sign-out, and in a restricted area</w:t>
-      </w:r>
-    </w:p>
-    <w:p>
-      <w:pPr>
-        <w:numPr>
-          <w:ilvl w:val="1"/>
-          <w:numId w:val="1030"/>
-        </w:numPr>
-        <w:pStyle w:val="Compact"/>
-      </w:pPr>
-      <w:r>
-        <w:rPr>
-          <w:rStyle w:val="VerbatimChar"/>
-        </w:rPr>
-        <w:t xml:space="preserve">BC-5003</w:t>
-      </w:r>
-      <w:r>
-        <w:t xml:space="preserve"> </w:t>
-      </w:r>
-      <w:r>
-        <w:rPr>
-          <w:b/>
-        </w:rPr>
-        <w:t xml:space="preserve">18:42 Server Room</w:t>
-      </w:r>
-      <w:r>
-        <w:t xml:space="preserve"> </w:t>
-      </w:r>
-      <w:r>
-        <w:t xml:space="preserve">— hours after the visitor signed out and returned the badge</w:t>
-      </w:r>
-    </w:p>
-    <w:p>
-      <w:pPr>
-        <w:numPr>
-          <w:ilvl w:val="1"/>
-          <w:numId w:val="1030"/>
-        </w:numPr>
-        <w:pStyle w:val="Compact"/>
-      </w:pPr>
-      <w:r>
-        <w:rPr>
-          <w:rStyle w:val="VerbatimChar"/>
-        </w:rPr>
-        <w:t xml:space="preserve">BC-5004</w:t>
-      </w:r>
-      <w:r>
-        <w:t xml:space="preserve"> </w:t>
-      </w:r>
-      <w:r>
-        <w:t xml:space="preserve">21:58 Server Room, employee badge</w:t>
-      </w:r>
-      <w:r>
-        <w:t xml:space="preserve"> </w:t>
-      </w:r>
-      <w:r>
-        <w:rPr>
-          <w:rStyle w:val="VerbatimChar"/>
-        </w:rPr>
-        <w:t xml:space="preserve">B-PXX-101</w:t>
-      </w:r>
-    </w:p>
-    <w:p>
-      <w:pPr>
-        <w:numPr>
-          <w:ilvl w:val="0"/>
-          <w:numId w:val="1029"/>
-        </w:numPr>
-      </w:pPr>
-      <w:r>
-        <w:rPr>
-          <w:b/>
-        </w:rPr>
-        <w:t xml:space="preserve">Discrepancy 1 (</w:t>
-      </w:r>
-      <w:r>
-        <w:rPr>
-          <w:rStyle w:val="VerbatimChar"/>
-          <w:b/>
-        </w:rPr>
-        <w:t xml:space="preserve">D-01</w:t>
-      </w:r>
-      <w:r>
-        <w:rPr>
-          <w:b/>
-        </w:rPr>
-        <w:t xml:space="preserve">, source event</w:t>
-      </w:r>
-      <w:r>
-        <w:rPr>
-          <w:b/>
-        </w:rPr>
-        <w:t xml:space="preserve"> </w:t>
-      </w:r>
-      <w:r>
-        <w:rPr>
-          <w:rStyle w:val="VerbatimChar"/>
-          <w:b/>
-        </w:rPr>
-        <w:t xml:space="preserve">BC-5003</w:t>
-      </w:r>
-      <w:r>
-        <w:rPr>
-          <w:b/>
-        </w:rPr>
-        <w:t xml:space="preserve">):</w:t>
-      </w:r>
-      <w:r>
-        <w:t xml:space="preserve"> </w:t>
-      </w:r>
-      <w:r>
-        <w:t xml:space="preserve">a temporary visitor badge that was recorded as returned was used to enter the server room at 18:42. Either the badge was not actually returned or it was cloned/misused — it must be contained and investigated.</w:t>
-      </w:r>
-    </w:p>
-    <w:p>
-      <w:pPr>
-        <w:numPr>
-          <w:ilvl w:val="0"/>
-          <w:numId w:val="1029"/>
-        </w:numPr>
-      </w:pPr>
-      <w:r>
-        <w:rPr>
-          <w:b/>
-        </w:rPr>
-        <w:t xml:space="preserve">Check the alarm log:</w:t>
       </w:r>
     </w:p>
     <w:p>
@@ -6732,31 +6635,49 @@
         <w:pStyle w:val="Compact"/>
       </w:pPr>
       <w:r>
-        <w:rPr>
-          <w:rStyle w:val="VerbatimChar"/>
-        </w:rPr>
-        <w:t xml:space="preserve">ALM-9006</w:t>
-      </w:r>
-      <w:r>
-        <w:t xml:space="preserve"> </w:t>
-      </w:r>
-      <w:r>
-        <w:t xml:space="preserve">17:02 Loading Dock, door held open —</w:t>
-      </w:r>
-      <w:r>
-        <w:t xml:space="preserve"> </w:t>
-      </w:r>
-      <w:r>
-        <w:rPr>
-          <w:b/>
-        </w:rPr>
-        <w:t xml:space="preserve">resolved</w:t>
-      </w:r>
-      <w:r>
-        <w:t xml:space="preserve"> </w:t>
-      </w:r>
-      <w:r>
-        <w:t xml:space="preserve">by security, so it reconciles</w:t>
+        <w:t xml:space="preserve">Visitor sign-in sheet: Casey Morgan in</w:t>
+      </w:r>
+      <w:r>
+        <w:t xml:space="preserve"> </w:t>
+      </w:r>
+      <w:r>
+        <w:rPr>
+          <w:b/>
+        </w:rPr>
+        <w:t xml:space="preserve">15:50</w:t>
+      </w:r>
+      <w:r>
+        <w:t xml:space="preserve">, out</w:t>
+      </w:r>
+      <w:r>
+        <w:t xml:space="preserve"> </w:t>
+      </w:r>
+      <w:r>
+        <w:rPr>
+          <w:b/>
+        </w:rPr>
+        <w:t xml:space="preserve">16:10</w:t>
+      </w:r>
+      <w:r>
+        <w:t xml:space="preserve">, badge</w:t>
+      </w:r>
+      <w:r>
+        <w:t xml:space="preserve"> </w:t>
+      </w:r>
+      <w:r>
+        <w:rPr>
+          <w:rStyle w:val="VerbatimChar"/>
+        </w:rPr>
+        <w:t xml:space="preserve">TEMP-PXX-014</w:t>
+      </w:r>
+      <w:r>
+        <w:t xml:space="preserve"> </w:t>
+      </w:r>
+      <w:r>
+        <w:rPr>
+          <w:b/>
+        </w:rPr>
+        <w:t xml:space="preserve">returned = Yes</w:t>
       </w:r>
     </w:p>
     <w:p>
@@ -6771,6 +6692,210 @@
         <w:rPr>
           <w:rStyle w:val="VerbatimChar"/>
         </w:rPr>
+        <w:t xml:space="preserve">BC-5001</w:t>
+      </w:r>
+      <w:r>
+        <w:t xml:space="preserve"> </w:t>
+      </w:r>
+      <w:r>
+        <w:t xml:space="preserve">15:55 Main Lobby — consistent with the visit</w:t>
+      </w:r>
+    </w:p>
+    <w:p>
+      <w:pPr>
+        <w:numPr>
+          <w:ilvl w:val="1"/>
+          <w:numId w:val="1031"/>
+        </w:numPr>
+        <w:pStyle w:val="Compact"/>
+      </w:pPr>
+      <w:r>
+        <w:rPr>
+          <w:rStyle w:val="VerbatimChar"/>
+        </w:rPr>
+        <w:t xml:space="preserve">BC-5002</w:t>
+      </w:r>
+      <w:r>
+        <w:t xml:space="preserve"> </w:t>
+      </w:r>
+      <w:r>
+        <w:t xml:space="preserve">16:18 Server Room — already after sign-out, and in a restricted area</w:t>
+      </w:r>
+    </w:p>
+    <w:p>
+      <w:pPr>
+        <w:numPr>
+          <w:ilvl w:val="1"/>
+          <w:numId w:val="1031"/>
+        </w:numPr>
+        <w:pStyle w:val="Compact"/>
+      </w:pPr>
+      <w:r>
+        <w:rPr>
+          <w:rStyle w:val="VerbatimChar"/>
+        </w:rPr>
+        <w:t xml:space="preserve">BC-5003</w:t>
+      </w:r>
+      <w:r>
+        <w:t xml:space="preserve"> </w:t>
+      </w:r>
+      <w:r>
+        <w:rPr>
+          <w:b/>
+        </w:rPr>
+        <w:t xml:space="preserve">18:42 Server Room</w:t>
+      </w:r>
+      <w:r>
+        <w:t xml:space="preserve"> </w:t>
+      </w:r>
+      <w:r>
+        <w:t xml:space="preserve">— hours after the visitor signed out and returned the badge</w:t>
+      </w:r>
+    </w:p>
+    <w:p>
+      <w:pPr>
+        <w:numPr>
+          <w:ilvl w:val="1"/>
+          <w:numId w:val="1031"/>
+        </w:numPr>
+        <w:pStyle w:val="Compact"/>
+      </w:pPr>
+      <w:r>
+        <w:rPr>
+          <w:rStyle w:val="VerbatimChar"/>
+        </w:rPr>
+        <w:t xml:space="preserve">BC-5004</w:t>
+      </w:r>
+      <w:r>
+        <w:t xml:space="preserve"> </w:t>
+      </w:r>
+      <w:r>
+        <w:t xml:space="preserve">21:58 Server Room, employee badge</w:t>
+      </w:r>
+      <w:r>
+        <w:t xml:space="preserve"> </w:t>
+      </w:r>
+      <w:r>
+        <w:rPr>
+          <w:rStyle w:val="VerbatimChar"/>
+        </w:rPr>
+        <w:t xml:space="preserve">B-PXX-101</w:t>
+      </w:r>
+    </w:p>
+    <w:p>
+      <w:pPr>
+        <w:numPr>
+          <w:ilvl w:val="0"/>
+          <w:numId w:val="1030"/>
+        </w:numPr>
+      </w:pPr>
+      <w:r>
+        <w:rPr>
+          <w:b/>
+        </w:rPr>
+        <w:t xml:space="preserve">Discrepancy 1 (</w:t>
+      </w:r>
+      <w:r>
+        <w:rPr>
+          <w:rStyle w:val="VerbatimChar"/>
+          <w:b/>
+        </w:rPr>
+        <w:t xml:space="preserve">D-01</w:t>
+      </w:r>
+      <w:r>
+        <w:rPr>
+          <w:b/>
+        </w:rPr>
+        <w:t xml:space="preserve">, source event</w:t>
+      </w:r>
+      <w:r>
+        <w:rPr>
+          <w:b/>
+        </w:rPr>
+        <w:t xml:space="preserve"> </w:t>
+      </w:r>
+      <w:r>
+        <w:rPr>
+          <w:rStyle w:val="VerbatimChar"/>
+          <w:b/>
+        </w:rPr>
+        <w:t xml:space="preserve">BC-5003</w:t>
+      </w:r>
+      <w:r>
+        <w:rPr>
+          <w:b/>
+        </w:rPr>
+        <w:t xml:space="preserve">):</w:t>
+      </w:r>
+      <w:r>
+        <w:t xml:space="preserve"> </w:t>
+      </w:r>
+      <w:r>
+        <w:t xml:space="preserve">a temporary visitor badge that was recorded as returned was used to enter the server room at 18:42. Either the badge was not actually returned or it was cloned/misused — it must be contained and investigated.</w:t>
+      </w:r>
+    </w:p>
+    <w:p>
+      <w:pPr>
+        <w:numPr>
+          <w:ilvl w:val="0"/>
+          <w:numId w:val="1030"/>
+        </w:numPr>
+      </w:pPr>
+      <w:r>
+        <w:rPr>
+          <w:b/>
+        </w:rPr>
+        <w:t xml:space="preserve">Check the alarm log:</w:t>
+      </w:r>
+    </w:p>
+    <w:p>
+      <w:pPr>
+        <w:numPr>
+          <w:ilvl w:val="1"/>
+          <w:numId w:val="1032"/>
+        </w:numPr>
+        <w:pStyle w:val="Compact"/>
+      </w:pPr>
+      <w:r>
+        <w:rPr>
+          <w:rStyle w:val="VerbatimChar"/>
+        </w:rPr>
+        <w:t xml:space="preserve">ALM-9006</w:t>
+      </w:r>
+      <w:r>
+        <w:t xml:space="preserve"> </w:t>
+      </w:r>
+      <w:r>
+        <w:t xml:space="preserve">17:02 Loading Dock, door held open —</w:t>
+      </w:r>
+      <w:r>
+        <w:t xml:space="preserve"> </w:t>
+      </w:r>
+      <w:r>
+        <w:rPr>
+          <w:b/>
+        </w:rPr>
+        <w:t xml:space="preserve">resolved</w:t>
+      </w:r>
+      <w:r>
+        <w:t xml:space="preserve"> </w:t>
+      </w:r>
+      <w:r>
+        <w:t xml:space="preserve">by security, so it reconciles</w:t>
+      </w:r>
+    </w:p>
+    <w:p>
+      <w:pPr>
+        <w:numPr>
+          <w:ilvl w:val="1"/>
+          <w:numId w:val="1032"/>
+        </w:numPr>
+        <w:pStyle w:val="Compact"/>
+      </w:pPr>
+      <w:r>
+        <w:rPr>
+          <w:rStyle w:val="VerbatimChar"/>
+        </w:rPr>
         <w:t xml:space="preserve">ALM-9007</w:t>
       </w:r>
       <w:r>
@@ -6811,7 +6936,7 @@
       <w:pPr>
         <w:numPr>
           <w:ilvl w:val="0"/>
-          <w:numId w:val="1029"/>
+          <w:numId w:val="1030"/>
         </w:numPr>
       </w:pPr>
       <w:r>
@@ -6863,7 +6988,7 @@
       <w:pPr>
         <w:numPr>
           <w:ilvl w:val="0"/>
-          <w:numId w:val="1029"/>
+          <w:numId w:val="1030"/>
         </w:numPr>
       </w:pPr>
       <w:r>
@@ -7339,7 +7464,7 @@
       <w:pPr>
         <w:numPr>
           <w:ilvl w:val="0"/>
-          <w:numId w:val="1032"/>
+          <w:numId w:val="1033"/>
         </w:numPr>
         <w:pStyle w:val="Compact"/>
       </w:pPr>
@@ -7366,7 +7491,7 @@
       <w:pPr>
         <w:numPr>
           <w:ilvl w:val="0"/>
-          <w:numId w:val="1032"/>
+          <w:numId w:val="1033"/>
         </w:numPr>
         <w:pStyle w:val="Compact"/>
       </w:pPr>
@@ -7393,7 +7518,7 @@
       <w:pPr>
         <w:numPr>
           <w:ilvl w:val="0"/>
-          <w:numId w:val="1032"/>
+          <w:numId w:val="1033"/>
         </w:numPr>
         <w:pStyle w:val="Compact"/>
       </w:pPr>
@@ -7444,7 +7569,7 @@
       <w:pPr>
         <w:numPr>
           <w:ilvl w:val="0"/>
-          <w:numId w:val="1032"/>
+          <w:numId w:val="1033"/>
         </w:numPr>
         <w:pStyle w:val="Compact"/>
       </w:pPr>
@@ -7566,7 +7691,7 @@
       <w:pPr>
         <w:numPr>
           <w:ilvl w:val="0"/>
-          <w:numId w:val="1033"/>
+          <w:numId w:val="1034"/>
         </w:numPr>
         <w:pStyle w:val="Compact"/>
       </w:pPr>
@@ -7596,7 +7721,7 @@
       <w:pPr>
         <w:numPr>
           <w:ilvl w:val="0"/>
-          <w:numId w:val="1033"/>
+          <w:numId w:val="1034"/>
         </w:numPr>
         <w:pStyle w:val="Compact"/>
       </w:pPr>
@@ -7638,7 +7763,7 @@
       <w:pPr>
         <w:numPr>
           <w:ilvl w:val="0"/>
-          <w:numId w:val="1033"/>
+          <w:numId w:val="1034"/>
         </w:numPr>
         <w:pStyle w:val="Compact"/>
       </w:pPr>
@@ -7687,7 +7812,7 @@
       <w:pPr>
         <w:numPr>
           <w:ilvl w:val="0"/>
-          <w:numId w:val="1034"/>
+          <w:numId w:val="1035"/>
         </w:numPr>
       </w:pPr>
       <w:r>
@@ -7743,7 +7868,7 @@
       <w:pPr>
         <w:numPr>
           <w:ilvl w:val="0"/>
-          <w:numId w:val="1034"/>
+          <w:numId w:val="1035"/>
         </w:numPr>
       </w:pPr>
       <w:r>
@@ -7757,88 +7882,88 @@
       <w:pPr>
         <w:numPr>
           <w:ilvl w:val="1"/>
+          <w:numId w:val="1036"/>
+        </w:numPr>
+        <w:pStyle w:val="Compact"/>
+      </w:pPr>
+      <w:r>
+        <w:rPr>
+          <w:rStyle w:val="VerbatimChar"/>
+        </w:rPr>
+        <w:t xml:space="preserve">EVT-6111</w:t>
+      </w:r>
+      <w:r>
+        <w:t xml:space="preserve"> </w:t>
+      </w:r>
+      <w:r>
+        <w:t xml:space="preserve">09:42 Main Lobby —</w:t>
+      </w:r>
+      <w:r>
+        <w:t xml:space="preserve"> </w:t>
+      </w:r>
+      <w:r>
+        <w:rPr>
+          <w:b/>
+        </w:rPr>
+        <w:t xml:space="preserve">before</w:t>
+      </w:r>
+      <w:r>
+        <w:t xml:space="preserve"> </w:t>
+      </w:r>
+      <w:r>
+        <w:t xml:space="preserve">the badge was reported lost</w:t>
+      </w:r>
+    </w:p>
+    <w:p>
+      <w:pPr>
+        <w:numPr>
+          <w:ilvl w:val="1"/>
+          <w:numId w:val="1036"/>
+        </w:numPr>
+        <w:pStyle w:val="Compact"/>
+      </w:pPr>
+      <w:r>
+        <w:rPr>
+          <w:rStyle w:val="VerbatimChar"/>
+        </w:rPr>
+        <w:t xml:space="preserve">EVT-6112</w:t>
+      </w:r>
+      <w:r>
+        <w:t xml:space="preserve"> </w:t>
+      </w:r>
+      <w:r>
+        <w:rPr>
+          <w:b/>
+        </w:rPr>
+        <w:t xml:space="preserve">11:12 Server Room</w:t>
+      </w:r>
+      <w:r>
+        <w:t xml:space="preserve"> </w:t>
+      </w:r>
+      <w:r>
+        <w:t xml:space="preserve">—</w:t>
+      </w:r>
+      <w:r>
+        <w:t xml:space="preserve"> </w:t>
+      </w:r>
+      <w:r>
+        <w:rPr>
+          <w:b/>
+        </w:rPr>
+        <w:t xml:space="preserve">after</w:t>
+      </w:r>
+      <w:r>
+        <w:t xml:space="preserve"> </w:t>
+      </w:r>
+      <w:r>
+        <w:t xml:space="preserve">the loss report, and in a restricted area. This is the event your incident report must cite.</w:t>
+      </w:r>
+    </w:p>
+    <w:p>
+      <w:pPr>
+        <w:numPr>
+          <w:ilvl w:val="0"/>
           <w:numId w:val="1035"/>
-        </w:numPr>
-        <w:pStyle w:val="Compact"/>
-      </w:pPr>
-      <w:r>
-        <w:rPr>
-          <w:rStyle w:val="VerbatimChar"/>
-        </w:rPr>
-        <w:t xml:space="preserve">EVT-6111</w:t>
-      </w:r>
-      <w:r>
-        <w:t xml:space="preserve"> </w:t>
-      </w:r>
-      <w:r>
-        <w:t xml:space="preserve">09:42 Main Lobby —</w:t>
-      </w:r>
-      <w:r>
-        <w:t xml:space="preserve"> </w:t>
-      </w:r>
-      <w:r>
-        <w:rPr>
-          <w:b/>
-        </w:rPr>
-        <w:t xml:space="preserve">before</w:t>
-      </w:r>
-      <w:r>
-        <w:t xml:space="preserve"> </w:t>
-      </w:r>
-      <w:r>
-        <w:t xml:space="preserve">the badge was reported lost</w:t>
-      </w:r>
-    </w:p>
-    <w:p>
-      <w:pPr>
-        <w:numPr>
-          <w:ilvl w:val="1"/>
-          <w:numId w:val="1035"/>
-        </w:numPr>
-        <w:pStyle w:val="Compact"/>
-      </w:pPr>
-      <w:r>
-        <w:rPr>
-          <w:rStyle w:val="VerbatimChar"/>
-        </w:rPr>
-        <w:t xml:space="preserve">EVT-6112</w:t>
-      </w:r>
-      <w:r>
-        <w:t xml:space="preserve"> </w:t>
-      </w:r>
-      <w:r>
-        <w:rPr>
-          <w:b/>
-        </w:rPr>
-        <w:t xml:space="preserve">11:12 Server Room</w:t>
-      </w:r>
-      <w:r>
-        <w:t xml:space="preserve"> </w:t>
-      </w:r>
-      <w:r>
-        <w:t xml:space="preserve">—</w:t>
-      </w:r>
-      <w:r>
-        <w:t xml:space="preserve"> </w:t>
-      </w:r>
-      <w:r>
-        <w:rPr>
-          <w:b/>
-        </w:rPr>
-        <w:t xml:space="preserve">after</w:t>
-      </w:r>
-      <w:r>
-        <w:t xml:space="preserve"> </w:t>
-      </w:r>
-      <w:r>
-        <w:t xml:space="preserve">the loss report, and in a restricted area. This is the event your incident report must cite.</w:t>
-      </w:r>
-    </w:p>
-    <w:p>
-      <w:pPr>
-        <w:numPr>
-          <w:ilvl w:val="0"/>
-          <w:numId w:val="1034"/>
         </w:numPr>
       </w:pPr>
       <w:r>
@@ -7988,7 +8113,22 @@
               <w:t xml:space="preserve">Revoked</w:t>
             </w:r>
             <w:r>
-              <w:t xml:space="preserve">)</w:t>
+              <w:t xml:space="preserve">) — change this row, do not add a second</w:t>
+            </w:r>
+            <w:r>
+              <w:t xml:space="preserve"> </w:t>
+            </w:r>
+            <w:r>
+              <w:rPr>
+                <w:rStyle w:val="VerbatimChar"/>
+              </w:rPr>
+              <w:t xml:space="preserve">B-PXX-115</w:t>
+            </w:r>
+            <w:r>
+              <w:t xml:space="preserve"> </w:t>
+            </w:r>
+            <w:r>
+              <w:t xml:space="preserve">row</w:t>
             </w:r>
           </w:p>
         </w:tc>
@@ -8084,7 +8224,7 @@
       <w:pPr>
         <w:numPr>
           <w:ilvl w:val="0"/>
-          <w:numId w:val="1034"/>
+          <w:numId w:val="1035"/>
         </w:numPr>
       </w:pPr>
       <w:r>
@@ -8494,7 +8634,7 @@
       <w:pPr>
         <w:numPr>
           <w:ilvl w:val="0"/>
-          <w:numId w:val="1036"/>
+          <w:numId w:val="1037"/>
         </w:numPr>
         <w:pStyle w:val="Compact"/>
       </w:pPr>
@@ -8545,7 +8685,7 @@
       <w:pPr>
         <w:numPr>
           <w:ilvl w:val="0"/>
-          <w:numId w:val="1036"/>
+          <w:numId w:val="1037"/>
         </w:numPr>
         <w:pStyle w:val="Compact"/>
       </w:pPr>
@@ -8596,7 +8736,7 @@
       <w:pPr>
         <w:numPr>
           <w:ilvl w:val="0"/>
-          <w:numId w:val="1036"/>
+          <w:numId w:val="1037"/>
         </w:numPr>
         <w:pStyle w:val="Compact"/>
       </w:pPr>
@@ -8623,7 +8763,7 @@
       <w:pPr>
         <w:numPr>
           <w:ilvl w:val="0"/>
-          <w:numId w:val="1036"/>
+          <w:numId w:val="1037"/>
         </w:numPr>
         <w:pStyle w:val="Compact"/>
       </w:pPr>
@@ -8665,7 +8805,7 @@
       <w:pPr>
         <w:numPr>
           <w:ilvl w:val="0"/>
-          <w:numId w:val="1036"/>
+          <w:numId w:val="1037"/>
         </w:numPr>
         <w:pStyle w:val="Compact"/>
       </w:pPr>
@@ -9861,7 +10001,7 @@
       <w:pPr>
         <w:numPr>
           <w:ilvl w:val="0"/>
-          <w:numId w:val="1037"/>
+          <w:numId w:val="1038"/>
         </w:numPr>
         <w:pStyle w:val="Compact"/>
       </w:pPr>
@@ -9882,7 +10022,7 @@
       <w:pPr>
         <w:numPr>
           <w:ilvl w:val="0"/>
-          <w:numId w:val="1037"/>
+          <w:numId w:val="1038"/>
         </w:numPr>
         <w:pStyle w:val="Compact"/>
       </w:pPr>
@@ -9903,7 +10043,7 @@
       <w:pPr>
         <w:numPr>
           <w:ilvl w:val="0"/>
-          <w:numId w:val="1037"/>
+          <w:numId w:val="1038"/>
         </w:numPr>
         <w:pStyle w:val="Compact"/>
       </w:pPr>
@@ -9924,7 +10064,7 @@
       <w:pPr>
         <w:numPr>
           <w:ilvl w:val="0"/>
-          <w:numId w:val="1037"/>
+          <w:numId w:val="1038"/>
         </w:numPr>
         <w:pStyle w:val="Compact"/>
       </w:pPr>
@@ -10248,7 +10388,7 @@
       <w:pPr>
         <w:numPr>
           <w:ilvl w:val="0"/>
-          <w:numId w:val="1038"/>
+          <w:numId w:val="1039"/>
         </w:numPr>
         <w:pStyle w:val="Compact"/>
       </w:pPr>
@@ -10275,7 +10415,7 @@
       <w:pPr>
         <w:numPr>
           <w:ilvl w:val="0"/>
-          <w:numId w:val="1038"/>
+          <w:numId w:val="1039"/>
         </w:numPr>
         <w:pStyle w:val="Compact"/>
       </w:pPr>
@@ -10287,7 +10427,7 @@
       <w:pPr>
         <w:numPr>
           <w:ilvl w:val="0"/>
-          <w:numId w:val="1038"/>
+          <w:numId w:val="1039"/>
         </w:numPr>
         <w:pStyle w:val="Compact"/>
       </w:pPr>
@@ -10883,6 +11023,9 @@
     <w:abstractNumId w:val="991"/>
   </w:num>
   <w:num w:numId="1013">
+    <w:abstractNumId w:val="991"/>
+  </w:num>
+  <w:num w:numId="1014">
     <w:abstractNumId w:val="99211"/>
     <w:lvlOverride w:ilvl="0">
       <w:startOverride w:val="1"/>
@@ -10912,9 +11055,6 @@
       <w:startOverride w:val="1"/>
     </w:lvlOverride>
   </w:num>
-  <w:num w:numId="1014">
-    <w:abstractNumId w:val="991"/>
-  </w:num>
   <w:num w:numId="1015">
     <w:abstractNumId w:val="991"/>
   </w:num>
@@ -10925,6 +11065,9 @@
     <w:abstractNumId w:val="991"/>
   </w:num>
   <w:num w:numId="1018">
+    <w:abstractNumId w:val="991"/>
+  </w:num>
+  <w:num w:numId="1019">
     <w:abstractNumId w:val="99211"/>
     <w:lvlOverride w:ilvl="0">
       <w:startOverride w:val="1"/>
@@ -10954,9 +11097,6 @@
       <w:startOverride w:val="1"/>
     </w:lvlOverride>
   </w:num>
-  <w:num w:numId="1019">
-    <w:abstractNumId w:val="991"/>
-  </w:num>
   <w:num w:numId="1020">
     <w:abstractNumId w:val="991"/>
   </w:num>
@@ -10964,6 +11104,9 @@
     <w:abstractNumId w:val="991"/>
   </w:num>
   <w:num w:numId="1022">
+    <w:abstractNumId w:val="991"/>
+  </w:num>
+  <w:num w:numId="1023">
     <w:abstractNumId w:val="99211"/>
     <w:lvlOverride w:ilvl="0">
       <w:startOverride w:val="1"/>
@@ -10993,9 +11136,6 @@
       <w:startOverride w:val="1"/>
     </w:lvlOverride>
   </w:num>
-  <w:num w:numId="1023">
-    <w:abstractNumId w:val="991"/>
-  </w:num>
   <w:num w:numId="1024">
     <w:abstractNumId w:val="991"/>
   </w:num>
@@ -11003,6 +11143,9 @@
     <w:abstractNumId w:val="991"/>
   </w:num>
   <w:num w:numId="1026">
+    <w:abstractNumId w:val="991"/>
+  </w:num>
+  <w:num w:numId="1027">
     <w:abstractNumId w:val="99211"/>
     <w:lvlOverride w:ilvl="0">
       <w:startOverride w:val="1"/>
@@ -11032,13 +11175,13 @@
       <w:startOverride w:val="1"/>
     </w:lvlOverride>
   </w:num>
-  <w:num w:numId="1027">
-    <w:abstractNumId w:val="991"/>
-  </w:num>
   <w:num w:numId="1028">
     <w:abstractNumId w:val="991"/>
   </w:num>
   <w:num w:numId="1029">
+    <w:abstractNumId w:val="991"/>
+  </w:num>
+  <w:num w:numId="1030">
     <w:abstractNumId w:val="99211"/>
     <w:lvlOverride w:ilvl="0">
       <w:startOverride w:val="1"/>
@@ -11068,9 +11211,6 @@
       <w:startOverride w:val="1"/>
     </w:lvlOverride>
   </w:num>
-  <w:num w:numId="1030">
-    <w:abstractNumId w:val="991"/>
-  </w:num>
   <w:num w:numId="1031">
     <w:abstractNumId w:val="991"/>
   </w:num>
@@ -11081,6 +11221,9 @@
     <w:abstractNumId w:val="991"/>
   </w:num>
   <w:num w:numId="1034">
+    <w:abstractNumId w:val="991"/>
+  </w:num>
+  <w:num w:numId="1035">
     <w:abstractNumId w:val="99211"/>
     <w:lvlOverride w:ilvl="0">
       <w:startOverride w:val="1"/>
@@ -11110,9 +11253,6 @@
       <w:startOverride w:val="1"/>
     </w:lvlOverride>
   </w:num>
-  <w:num w:numId="1035">
-    <w:abstractNumId w:val="991"/>
-  </w:num>
   <w:num w:numId="1036">
     <w:abstractNumId w:val="991"/>
   </w:num>
@@ -11120,6 +11260,9 @@
     <w:abstractNumId w:val="991"/>
   </w:num>
   <w:num w:numId="1038">
+    <w:abstractNumId w:val="991"/>
+  </w:num>
+  <w:num w:numId="1039">
     <w:abstractNumId w:val="99211"/>
     <w:lvlOverride w:ilvl="0">
       <w:startOverride w:val="1"/>

</xml_diff>